<commit_message>
move the UAS report
</commit_message>
<xml_diff>
--- a/report/A11202214623_STKI_LaporanTugasAkhir.docx
+++ b/report/A11202214623_STKI_LaporanTugasAkhir.docx
@@ -125,7 +125,23 @@
             <w:sz w:val="32"/>
             <w:szCs w:val="32"/>
           </w:rPr>
-          <w:t>https://github.com/stemastr777/STKI.git</w:t>
+          <w:t>https://github.com/stemastr</w:t>
+        </w:r>
+        <w:r>
+          <w:rPr>
+            <w:rStyle w:val="Hyperlink"/>
+            <w:sz w:val="32"/>
+            <w:szCs w:val="32"/>
+          </w:rPr>
+          <w:t>7</w:t>
+        </w:r>
+        <w:r>
+          <w:rPr>
+            <w:rStyle w:val="Hyperlink"/>
+            <w:sz w:val="32"/>
+            <w:szCs w:val="32"/>
+          </w:rPr>
+          <w:t>77/STKI.git</w:t>
         </w:r>
       </w:hyperlink>
       <w:r>
@@ -169,7 +185,34 @@
           <w:sz w:val="36"/>
           <w:szCs w:val="36"/>
         </w:rPr>
-        <w:t>SummitSearch – Sistem Pencarian Gambar Gunung Berbasis Visi Komputer</w:t>
+        <w:t xml:space="preserve">SummitSearch – </w:t>
+      </w:r>
+      <w:r>
+        <w:rPr>
+          <w:b/>
+          <w:bCs/>
+          <w:sz w:val="36"/>
+          <w:szCs w:val="36"/>
+        </w:rPr>
+        <w:t xml:space="preserve">Pencarian </w:t>
+      </w:r>
+      <w:r>
+        <w:rPr>
+          <w:b/>
+          <w:bCs/>
+          <w:sz w:val="36"/>
+          <w:szCs w:val="36"/>
+        </w:rPr>
+        <w:t>Gunung</w:t>
+      </w:r>
+      <w:r>
+        <w:rPr>
+          <w:b/>
+          <w:bCs/>
+          <w:sz w:val="36"/>
+          <w:szCs w:val="36"/>
+        </w:rPr>
+        <w:t xml:space="preserve"> Berbasis Atmosfer Visual dan Semantik</w:t>
       </w:r>
     </w:p>
     <w:p>
@@ -375,6 +418,11 @@
       <w:r>
         <w:t>Mengimplementasikan pencarian pada perangkat CPU agar sistem bersifat portabel dan dapat dijalankan tanpa ketergantungan pada perangkat keras khusus.</w:t>
       </w:r>
+    </w:p>
+    <w:p>
+      <w:pPr>
+        <w:pStyle w:val="ListParagraph"/>
+      </w:pPr>
     </w:p>
     <w:p>
       <w:pPr>
@@ -2268,6 +2316,18 @@
       <w14:ligatures w14:val="none"/>
     </w:rPr>
   </w:style>
+  <w:style w:type="character" w:styleId="FollowedHyperlink">
+    <w:name w:val="FollowedHyperlink"/>
+    <w:basedOn w:val="DefaultParagraphFont"/>
+    <w:uiPriority w:val="99"/>
+    <w:semiHidden/>
+    <w:unhideWhenUsed/>
+    <w:rsid w:val="00821F1E"/>
+    <w:rPr>
+      <w:color w:val="954F72" w:themeColor="followedHyperlink"/>
+      <w:u w:val="single"/>
+    </w:rPr>
+  </w:style>
 </w:styles>
 </file>
 

</xml_diff>